<commit_message>
Refine Word HLD: element-to-select shown as 'element (colour)' per box
State the exact ArchiMate element + layer colour for each box (Business
Actor/yellow, Application Component/blue, System Software/green) and note
Node as an alternative for Entra ID.

https://claude.ai/code/session_01C2bfhs5gRm7LvZCm4sYJ8a
</commit_message>
<xml_diff>
--- a/docs/architecture/Ofgem-8x8-Creovai-AsIs-HLD.docx
+++ b/docs/architecture/Ofgem-8x8-Creovai-AsIs-HLD.docx
@@ -90,16 +90,15 @@
         <w:tblLook w:firstColumn="1" w:firstRow="1" w:lastColumn="0" w:lastRow="0" w:noHBand="0" w:noVBand="1" w:val="04A0"/>
       </w:tblPr>
       <w:tblGrid>
-        <w:gridCol w:w="1728"/>
-        <w:gridCol w:w="1728"/>
-        <w:gridCol w:w="1728"/>
-        <w:gridCol w:w="1728"/>
-        <w:gridCol w:w="1728"/>
+        <w:gridCol w:w="2160"/>
+        <w:gridCol w:w="2160"/>
+        <w:gridCol w:w="2160"/>
+        <w:gridCol w:w="2160"/>
       </w:tblGrid>
       <w:tr>
         <w:tc>
           <w:tcPr>
-            <w:tcW w:type="dxa" w:w="1728"/>
+            <w:tcW w:type="dxa" w:w="2160"/>
           </w:tcPr>
           <w:p>
             <w:r/>
@@ -114,7 +113,7 @@
         </w:tc>
         <w:tc>
           <w:tcPr>
-            <w:tcW w:type="dxa" w:w="1728"/>
+            <w:tcW w:type="dxa" w:w="2160"/>
           </w:tcPr>
           <w:p>
             <w:r/>
@@ -123,28 +122,13 @@
                 <w:b/>
                 <w:sz w:val="20"/>
               </w:rPr>
-              <w:t>ArchiMate element (pick this in palette)</w:t>
+              <w:t>Element to select (pick this in palette)</w:t>
             </w:r>
           </w:p>
         </w:tc>
         <w:tc>
           <w:tcPr>
-            <w:tcW w:type="dxa" w:w="1728"/>
-          </w:tcPr>
-          <w:p>
-            <w:r/>
-            <w:r>
-              <w:rPr>
-                <w:b/>
-                <w:sz w:val="20"/>
-              </w:rPr>
-              <w:t>Layer</w:t>
-            </w:r>
-          </w:p>
-        </w:tc>
-        <w:tc>
-          <w:tcPr>
-            <w:tcW w:type="dxa" w:w="1728"/>
+            <w:tcW w:type="dxa" w:w="2160"/>
           </w:tcPr>
           <w:p>
             <w:r/>
@@ -159,7 +143,7 @@
         </w:tc>
         <w:tc>
           <w:tcPr>
-            <w:tcW w:type="dxa" w:w="1728"/>
+            <w:tcW w:type="dxa" w:w="2160"/>
           </w:tcPr>
           <w:p>
             <w:r/>
@@ -176,7 +160,7 @@
       <w:tr>
         <w:tc>
           <w:tcPr>
-            <w:tcW w:type="dxa" w:w="1728"/>
+            <w:tcW w:type="dxa" w:w="2160"/>
           </w:tcPr>
           <w:p>
             <w:r/>
@@ -191,7 +175,7 @@
         </w:tc>
         <w:tc>
           <w:tcPr>
-            <w:tcW w:type="dxa" w:w="1728"/>
+            <w:tcW w:type="dxa" w:w="2160"/>
           </w:tcPr>
           <w:p>
             <w:r/>
@@ -200,28 +184,13 @@
                 <w:b w:val="0"/>
                 <w:sz w:val="20"/>
               </w:rPr>
-              <w:t>Business Actor</w:t>
+              <w:t>Business Actor (yellow)</w:t>
             </w:r>
           </w:p>
         </w:tc>
         <w:tc>
           <w:tcPr>
-            <w:tcW w:type="dxa" w:w="1728"/>
-          </w:tcPr>
-          <w:p>
-            <w:r/>
-            <w:r>
-              <w:rPr>
-                <w:b w:val="0"/>
-                <w:sz w:val="20"/>
-              </w:rPr>
-              <w:t>Business</w:t>
-            </w:r>
-          </w:p>
-        </w:tc>
-        <w:tc>
-          <w:tcPr>
-            <w:tcW w:type="dxa" w:w="1728"/>
+            <w:tcW w:type="dxa" w:w="2160"/>
             <w:shd w:val="clear" w:color="auto" w:fill="FFFFB5"/>
           </w:tcPr>
           <w:p>
@@ -237,7 +206,7 @@
         </w:tc>
         <w:tc>
           <w:tcPr>
-            <w:tcW w:type="dxa" w:w="1728"/>
+            <w:tcW w:type="dxa" w:w="2160"/>
           </w:tcPr>
           <w:p>
             <w:r/>
@@ -254,7 +223,7 @@
       <w:tr>
         <w:tc>
           <w:tcPr>
-            <w:tcW w:type="dxa" w:w="1728"/>
+            <w:tcW w:type="dxa" w:w="2160"/>
           </w:tcPr>
           <w:p>
             <w:r/>
@@ -269,7 +238,7 @@
         </w:tc>
         <w:tc>
           <w:tcPr>
-            <w:tcW w:type="dxa" w:w="1728"/>
+            <w:tcW w:type="dxa" w:w="2160"/>
           </w:tcPr>
           <w:p>
             <w:r/>
@@ -278,28 +247,13 @@
                 <w:b w:val="0"/>
                 <w:sz w:val="20"/>
               </w:rPr>
-              <w:t>Application Component</w:t>
+              <w:t>Application Component (blue)</w:t>
             </w:r>
           </w:p>
         </w:tc>
         <w:tc>
           <w:tcPr>
-            <w:tcW w:type="dxa" w:w="1728"/>
-          </w:tcPr>
-          <w:p>
-            <w:r/>
-            <w:r>
-              <w:rPr>
-                <w:b w:val="0"/>
-                <w:sz w:val="20"/>
-              </w:rPr>
-              <w:t>Application</w:t>
-            </w:r>
-          </w:p>
-        </w:tc>
-        <w:tc>
-          <w:tcPr>
-            <w:tcW w:type="dxa" w:w="1728"/>
+            <w:tcW w:type="dxa" w:w="2160"/>
             <w:shd w:val="clear" w:color="auto" w:fill="B5FFFF"/>
           </w:tcPr>
           <w:p>
@@ -315,7 +269,7 @@
         </w:tc>
         <w:tc>
           <w:tcPr>
-            <w:tcW w:type="dxa" w:w="1728"/>
+            <w:tcW w:type="dxa" w:w="2160"/>
           </w:tcPr>
           <w:p>
             <w:r/>
@@ -332,7 +286,7 @@
       <w:tr>
         <w:tc>
           <w:tcPr>
-            <w:tcW w:type="dxa" w:w="1728"/>
+            <w:tcW w:type="dxa" w:w="2160"/>
           </w:tcPr>
           <w:p>
             <w:r/>
@@ -347,7 +301,7 @@
         </w:tc>
         <w:tc>
           <w:tcPr>
-            <w:tcW w:type="dxa" w:w="1728"/>
+            <w:tcW w:type="dxa" w:w="2160"/>
           </w:tcPr>
           <w:p>
             <w:r/>
@@ -356,28 +310,13 @@
                 <w:b w:val="0"/>
                 <w:sz w:val="20"/>
               </w:rPr>
-              <w:t>Application Component</w:t>
+              <w:t>Application Component (blue)</w:t>
             </w:r>
           </w:p>
         </w:tc>
         <w:tc>
           <w:tcPr>
-            <w:tcW w:type="dxa" w:w="1728"/>
-          </w:tcPr>
-          <w:p>
-            <w:r/>
-            <w:r>
-              <w:rPr>
-                <w:b w:val="0"/>
-                <w:sz w:val="20"/>
-              </w:rPr>
-              <w:t>Application</w:t>
-            </w:r>
-          </w:p>
-        </w:tc>
-        <w:tc>
-          <w:tcPr>
-            <w:tcW w:type="dxa" w:w="1728"/>
+            <w:tcW w:type="dxa" w:w="2160"/>
             <w:shd w:val="clear" w:color="auto" w:fill="B5FFFF"/>
           </w:tcPr>
           <w:p>
@@ -393,7 +332,7 @@
         </w:tc>
         <w:tc>
           <w:tcPr>
-            <w:tcW w:type="dxa" w:w="1728"/>
+            <w:tcW w:type="dxa" w:w="2160"/>
           </w:tcPr>
           <w:p>
             <w:r/>
@@ -410,7 +349,7 @@
       <w:tr>
         <w:tc>
           <w:tcPr>
-            <w:tcW w:type="dxa" w:w="1728"/>
+            <w:tcW w:type="dxa" w:w="2160"/>
           </w:tcPr>
           <w:p>
             <w:r/>
@@ -425,7 +364,7 @@
         </w:tc>
         <w:tc>
           <w:tcPr>
-            <w:tcW w:type="dxa" w:w="1728"/>
+            <w:tcW w:type="dxa" w:w="2160"/>
           </w:tcPr>
           <w:p>
             <w:r/>
@@ -434,28 +373,13 @@
                 <w:b w:val="0"/>
                 <w:sz w:val="20"/>
               </w:rPr>
-              <w:t>Application Component</w:t>
+              <w:t>Application Component (blue)</w:t>
             </w:r>
           </w:p>
         </w:tc>
         <w:tc>
           <w:tcPr>
-            <w:tcW w:type="dxa" w:w="1728"/>
-          </w:tcPr>
-          <w:p>
-            <w:r/>
-            <w:r>
-              <w:rPr>
-                <w:b w:val="0"/>
-                <w:sz w:val="20"/>
-              </w:rPr>
-              <w:t>Application</w:t>
-            </w:r>
-          </w:p>
-        </w:tc>
-        <w:tc>
-          <w:tcPr>
-            <w:tcW w:type="dxa" w:w="1728"/>
+            <w:tcW w:type="dxa" w:w="2160"/>
             <w:shd w:val="clear" w:color="auto" w:fill="B5FFFF"/>
           </w:tcPr>
           <w:p>
@@ -471,7 +395,7 @@
         </w:tc>
         <w:tc>
           <w:tcPr>
-            <w:tcW w:type="dxa" w:w="1728"/>
+            <w:tcW w:type="dxa" w:w="2160"/>
           </w:tcPr>
           <w:p>
             <w:r/>
@@ -488,7 +412,7 @@
       <w:tr>
         <w:tc>
           <w:tcPr>
-            <w:tcW w:type="dxa" w:w="1728"/>
+            <w:tcW w:type="dxa" w:w="2160"/>
           </w:tcPr>
           <w:p>
             <w:r/>
@@ -503,7 +427,7 @@
         </w:tc>
         <w:tc>
           <w:tcPr>
-            <w:tcW w:type="dxa" w:w="1728"/>
+            <w:tcW w:type="dxa" w:w="2160"/>
           </w:tcPr>
           <w:p>
             <w:r/>
@@ -512,28 +436,13 @@
                 <w:b w:val="0"/>
                 <w:sz w:val="20"/>
               </w:rPr>
-              <w:t>System Software</w:t>
+              <w:t>System Software (green)</w:t>
             </w:r>
           </w:p>
         </w:tc>
         <w:tc>
           <w:tcPr>
-            <w:tcW w:type="dxa" w:w="1728"/>
-          </w:tcPr>
-          <w:p>
-            <w:r/>
-            <w:r>
-              <w:rPr>
-                <w:b w:val="0"/>
-                <w:sz w:val="20"/>
-              </w:rPr>
-              <w:t>Technology</w:t>
-            </w:r>
-          </w:p>
-        </w:tc>
-        <w:tc>
-          <w:tcPr>
-            <w:tcW w:type="dxa" w:w="1728"/>
+            <w:tcW w:type="dxa" w:w="2160"/>
             <w:shd w:val="clear" w:color="auto" w:fill="C9E7B8"/>
           </w:tcPr>
           <w:p>
@@ -549,7 +458,7 @@
         </w:tc>
         <w:tc>
           <w:tcPr>
-            <w:tcW w:type="dxa" w:w="1728"/>
+            <w:tcW w:type="dxa" w:w="2160"/>
           </w:tcPr>
           <w:p>
             <w:r/>
@@ -570,10 +479,21 @@
         <w:rPr>
           <w:b/>
         </w:rPr>
+        <w:t xml:space="preserve">Microsoft Entra ID: </w:t>
+      </w:r>
+      <w:r>
+        <w:t>use System Software (green). The Technology "Node" (green) is an acceptable alternative if you prefer.</w:t>
+      </w:r>
+    </w:p>
+    <w:p>
+      <w:r>
+        <w:rPr>
+          <w:b/>
+        </w:rPr>
         <w:t xml:space="preserve">Note: </w:t>
       </w:r>
       <w:r>
-        <w:t>these are element shapes, not the ArchiMate "Artifact" element. Do NOT use the Technology "Artifact" element here — use the types in the table above.</w:t>
+        <w:t>these are element shapes, not the ArchiMate "Artifact" element. Do NOT use the Technology "Artifact" element here — use the types above.</w:t>
       </w:r>
     </w:p>
     <w:p>

</xml_diff>

<commit_message>
Correct Teams integration direction (8x8 serves Teams)
Per clarification: Teams is used org-wide internally; only certain users
(c.208) use 8x8; 8x8 is integrated with Teams so telephony is surfaced
within Teams. Flip the Teams relationship to 8x8 -> Teams (serving) for
consistency with 8x8 -> Users, and clarify the box labels.

https://claude.ai/code/session_01C2bfhs5gRm7LvZCm4sYJ8a
</commit_message>
<xml_diff>
--- a/docs/architecture/Ofgem-8x8-Creovai-AsIs-HLD.docx
+++ b/docs/architecture/Ofgem-8x8-Creovai-AsIs-HLD.docx
@@ -38,7 +38,7 @@
       <w:r>
         <w:drawing>
           <wp:inline xmlns:a="http://schemas.openxmlformats.org/drawingml/2006/main" xmlns:pic="http://schemas.openxmlformats.org/drawingml/2006/picture">
-            <wp:extent cx="4114800" cy="5444346"/>
+            <wp:extent cx="4114800" cy="2843511"/>
             <wp:docPr id="1" name="Picture 1"/>
             <wp:cNvGraphicFramePr>
               <a:graphicFrameLocks noChangeAspect="1"/>
@@ -59,7 +59,7 @@
                   <pic:spPr>
                     <a:xfrm>
                       <a:off x="0" y="0"/>
-                      <a:ext cx="4114800" cy="5444346"/>
+                      <a:ext cx="4114800" cy="2843511"/>
                     </a:xfrm>
                     <a:prstGeom prst="rect"/>
                   </pic:spPr>
@@ -169,7 +169,7 @@
                 <w:b/>
                 <w:sz w:val="20"/>
               </w:rPr>
-              <w:t>Users (c.208)</w:t>
+              <w:t>8x8 Users (c.208 only)</w:t>
             </w:r>
           </w:p>
         </w:tc>
@@ -232,7 +232,7 @@
                 <w:b/>
                 <w:sz w:val="20"/>
               </w:rPr>
-              <w:t>Microsoft Teams</w:t>
+              <w:t>Microsoft Teams (org-wide)</w:t>
             </w:r>
           </w:p>
         </w:tc>
@@ -714,7 +714,7 @@
                 <w:b/>
                 <w:sz w:val="20"/>
               </w:rPr>
-              <w:t>Microsoft Teams → 8x8</w:t>
+              <w:t>8x8 → Microsoft Teams</w:t>
             </w:r>
           </w:p>
         </w:tc>
@@ -759,7 +759,7 @@
                 <w:b w:val="0"/>
                 <w:sz w:val="20"/>
               </w:rPr>
-              <w:t>integration</w:t>
+              <w:t>telephony in Teams (integration)</w:t>
             </w:r>
           </w:p>
         </w:tc>
@@ -776,7 +776,7 @@
                 <w:b/>
                 <w:sz w:val="20"/>
               </w:rPr>
-              <w:t>8x8 → Users</w:t>
+              <w:t>8x8 → 8x8 Users</w:t>
             </w:r>
           </w:p>
         </w:tc>

</xml_diff>

<commit_message>
Apply TDA review fixes: SSO direct to both, Users->8x8, Creovai label
- SSO shown as two independent arrows (Entra->8x8, Entra->Teams), not
  chained via Teams.
- Reverse Users relationship to Users->8x8 (users initiate calls).
- Label 8x8<->Creovai as 'API / HTTPS JSON' (single path, no Azure).
- Label 8x8->Teams as 'Teams integration (user-scoped)'.

https://claude.ai/code/session_01C2bfhs5gRm7LvZCm4sYJ8a
</commit_message>
<xml_diff>
--- a/docs/architecture/Ofgem-8x8-Creovai-AsIs-HLD.docx
+++ b/docs/architecture/Ofgem-8x8-Creovai-AsIs-HLD.docx
@@ -38,7 +38,7 @@
       <w:r>
         <w:drawing>
           <wp:inline xmlns:a="http://schemas.openxmlformats.org/drawingml/2006/main" xmlns:pic="http://schemas.openxmlformats.org/drawingml/2006/picture">
-            <wp:extent cx="4114800" cy="2843511"/>
+            <wp:extent cx="4114800" cy="4336961"/>
             <wp:docPr id="1" name="Picture 1"/>
             <wp:cNvGraphicFramePr>
               <a:graphicFrameLocks noChangeAspect="1"/>
@@ -59,7 +59,7 @@
                   <pic:spPr>
                     <a:xfrm>
                       <a:off x="0" y="0"/>
-                      <a:ext cx="4114800" cy="2843511"/>
+                      <a:ext cx="4114800" cy="4336961"/>
                     </a:xfrm>
                     <a:prstGeom prst="rect"/>
                   </pic:spPr>
@@ -590,6 +590,68 @@
                 <w:b/>
                 <w:sz w:val="20"/>
               </w:rPr>
+              <w:t>8x8 Users → 8x8</w:t>
+            </w:r>
+          </w:p>
+        </w:tc>
+        <w:tc>
+          <w:tcPr>
+            <w:tcW w:type="dxa" w:w="2160"/>
+          </w:tcPr>
+          <w:p>
+            <w:r/>
+            <w:r>
+              <w:rPr>
+                <w:b w:val="0"/>
+                <w:sz w:val="20"/>
+              </w:rPr>
+              <w:t>Serving</w:t>
+            </w:r>
+          </w:p>
+        </w:tc>
+        <w:tc>
+          <w:tcPr>
+            <w:tcW w:type="dxa" w:w="2160"/>
+          </w:tcPr>
+          <w:p>
+            <w:r/>
+            <w:r>
+              <w:rPr>
+                <w:b w:val="0"/>
+                <w:sz w:val="20"/>
+              </w:rPr>
+              <w:t>Solid line, open arrowhead</w:t>
+            </w:r>
+          </w:p>
+        </w:tc>
+        <w:tc>
+          <w:tcPr>
+            <w:tcW w:type="dxa" w:w="2160"/>
+          </w:tcPr>
+          <w:p>
+            <w:r/>
+            <w:r>
+              <w:rPr>
+                <w:b w:val="0"/>
+                <w:sz w:val="20"/>
+              </w:rPr>
+              <w:t>telephony (users initiate calls)</w:t>
+            </w:r>
+          </w:p>
+        </w:tc>
+      </w:tr>
+      <w:tr>
+        <w:tc>
+          <w:tcPr>
+            <w:tcW w:type="dxa" w:w="2160"/>
+          </w:tcPr>
+          <w:p>
+            <w:r/>
+            <w:r>
+              <w:rPr>
+                <w:b/>
+                <w:sz w:val="20"/>
+              </w:rPr>
               <w:t>Microsoft Entra ID → 8x8</w:t>
             </w:r>
           </w:p>
@@ -635,7 +697,7 @@
                 <w:b w:val="0"/>
                 <w:sz w:val="20"/>
               </w:rPr>
-              <w:t>SSO</w:t>
+              <w:t>SSO (direct)</w:t>
             </w:r>
           </w:p>
         </w:tc>
@@ -697,7 +759,7 @@
                 <w:b w:val="0"/>
                 <w:sz w:val="20"/>
               </w:rPr>
-              <w:t>SSO</w:t>
+              <w:t>SSO (direct)</w:t>
             </w:r>
           </w:p>
         </w:tc>
@@ -759,69 +821,7 @@
                 <w:b w:val="0"/>
                 <w:sz w:val="20"/>
               </w:rPr>
-              <w:t>telephony in Teams (integration)</w:t>
-            </w:r>
-          </w:p>
-        </w:tc>
-      </w:tr>
-      <w:tr>
-        <w:tc>
-          <w:tcPr>
-            <w:tcW w:type="dxa" w:w="2160"/>
-          </w:tcPr>
-          <w:p>
-            <w:r/>
-            <w:r>
-              <w:rPr>
-                <w:b/>
-                <w:sz w:val="20"/>
-              </w:rPr>
-              <w:t>8x8 → 8x8 Users</w:t>
-            </w:r>
-          </w:p>
-        </w:tc>
-        <w:tc>
-          <w:tcPr>
-            <w:tcW w:type="dxa" w:w="2160"/>
-          </w:tcPr>
-          <w:p>
-            <w:r/>
-            <w:r>
-              <w:rPr>
-                <w:b w:val="0"/>
-                <w:sz w:val="20"/>
-              </w:rPr>
-              <w:t>Serving</w:t>
-            </w:r>
-          </w:p>
-        </w:tc>
-        <w:tc>
-          <w:tcPr>
-            <w:tcW w:type="dxa" w:w="2160"/>
-          </w:tcPr>
-          <w:p>
-            <w:r/>
-            <w:r>
-              <w:rPr>
-                <w:b w:val="0"/>
-                <w:sz w:val="20"/>
-              </w:rPr>
-              <w:t>Solid line, open arrowhead</w:t>
-            </w:r>
-          </w:p>
-        </w:tc>
-        <w:tc>
-          <w:tcPr>
-            <w:tcW w:type="dxa" w:w="2160"/>
-          </w:tcPr>
-          <w:p>
-            <w:r/>
-            <w:r>
-              <w:rPr>
-                <w:b w:val="0"/>
-                <w:sz w:val="20"/>
-              </w:rPr>
-              <w:t>telephony</w:t>
+              <w:t>Teams integration (user-scoped)</w:t>
             </w:r>
           </w:p>
         </w:tc>
@@ -883,7 +883,7 @@
                 <w:b w:val="0"/>
                 <w:sz w:val="20"/>
               </w:rPr>
-              <w:t>HTTPS / JSON (in / out)</w:t>
+              <w:t>API / HTTPS JSON</w:t>
             </w:r>
           </w:p>
         </w:tc>

</xml_diff>

<commit_message>
Correct Users relationship to ArchiMate Serving direction (8x8 -> Users)
Serving points provider -> consumer, so 8x8 (telephony provider) serves
Users. Revert the earlier Users -> 8x8 direction which mixed behavioural
flow with a structural serving relationship. All other relationships
verified correct.

https://claude.ai/code/session_01C2bfhs5gRm7LvZCm4sYJ8a
</commit_message>
<xml_diff>
--- a/docs/architecture/Ofgem-8x8-Creovai-AsIs-HLD.docx
+++ b/docs/architecture/Ofgem-8x8-Creovai-AsIs-HLD.docx
@@ -38,7 +38,7 @@
       <w:r>
         <w:drawing>
           <wp:inline xmlns:a="http://schemas.openxmlformats.org/drawingml/2006/main" xmlns:pic="http://schemas.openxmlformats.org/drawingml/2006/picture">
-            <wp:extent cx="4114800" cy="4336961"/>
+            <wp:extent cx="4114800" cy="2774092"/>
             <wp:docPr id="1" name="Picture 1"/>
             <wp:cNvGraphicFramePr>
               <a:graphicFrameLocks noChangeAspect="1"/>
@@ -59,7 +59,7 @@
                   <pic:spPr>
                     <a:xfrm>
                       <a:off x="0" y="0"/>
-                      <a:ext cx="4114800" cy="4336961"/>
+                      <a:ext cx="4114800" cy="2774092"/>
                     </a:xfrm>
                     <a:prstGeom prst="rect"/>
                   </pic:spPr>
@@ -590,7 +590,7 @@
                 <w:b/>
                 <w:sz w:val="20"/>
               </w:rPr>
-              <w:t>8x8 Users → 8x8</w:t>
+              <w:t>8x8 → 8x8 Users</w:t>
             </w:r>
           </w:p>
         </w:tc>
@@ -635,7 +635,7 @@
                 <w:b w:val="0"/>
                 <w:sz w:val="20"/>
               </w:rPr>
-              <w:t>telephony (users initiate calls)</w:t>
+              <w:t>telephony (provider serves consumer)</w:t>
             </w:r>
           </w:p>
         </w:tc>

</xml_diff>